<commit_message>
Huacho Perú Compras: dirigir al Director actual de la DCEME
Co-Authored-By: Claude Opus 5.5 <noreply@anthropic.com>
Claude-Session: https://claude.ai/code/session_01Ls5dNjYBLNjXxuGTDk7v3H
</commit_message>
<xml_diff>
--- a/carta-reclamo/huacho/Carta_Huacho_4_PeruCompras.docx
+++ b/carta-reclamo/huacho/Carta_Huacho_4_PeruCompras.docx
@@ -27,7 +27,7 @@
         <w:pStyle w:val="BodyText"/>
       </w:pPr>
       <w:r>
-        <w:t xml:space="preserve">Señora</w:t>
+        <w:t xml:space="preserve">Señor</w:t>
       </w:r>
       <w:r>
         <w:br/>
@@ -37,13 +37,13 @@
           <w:bCs/>
           <w:b/>
         </w:rPr>
-        <w:t xml:space="preserve">AIDA MÓNICA LA ROSA SÁNCHEZ BAYES DE LÓPEZ</w:t>
+        <w:t xml:space="preserve">NEAL MARTÍN MAURA GONZALES</w:t>
       </w:r>
       <w:r>
         <w:br/>
       </w:r>
       <w:r>
-        <w:t xml:space="preserve">Directora de la Dirección de Compras Electrónicas y Modalidades Eficientes – DCEME</w:t>
+        <w:t xml:space="preserve">Director de la Dirección de Compras Electrónicas y Modalidades Eficientes – DCEME</w:t>
       </w:r>
       <w:r>
         <w:br/>

</xml_diff>